<commit_message>
next corrections based on Kück/Leha comments
</commit_message>
<xml_diff>
--- a/_tables/tbl-anc-wai-coach-mmrm.docx
+++ b/_tables/tbl-anc-wai-coach-mmrm.docx
@@ -187,7 +187,7 @@
                 <w:rFonts w:ascii="Calibri" w:hAnsi="Calibri"/>
                 <w:sz w:val="20"/>
               </w:rPr>
-              <w:t xml:space="default">11 to 20</w:t>
+              <w:t xml:space="default">10 to 19</w:t>
             </w:r>
           </w:p>
         </w:tc>
@@ -515,7 +515,7 @@
                 <w:rFonts w:ascii="Calibri" w:hAnsi="Calibri"/>
                 <w:sz w:val="20"/>
               </w:rPr>
-              <w:t xml:space="default">0·39</w:t>
+              <w:t xml:space="default">0·40</w:t>
             </w:r>
           </w:p>
         </w:tc>
@@ -771,55 +771,55 @@
                 <w:rFonts w:ascii="Calibri" w:hAnsi="Calibri"/>
                 <w:sz w:val="20"/>
               </w:rPr>
-              <w:t xml:space="default">1·1</w:t>
-            </w:r>
-          </w:p>
-        </w:tc>
-        <w:tc>
-          <w:tcPr>
-            <w:tcBorders>
-              <w:top w:val="single" w:space="0" w:color="D3D3D3"/>
-              <w:bottom w:val="single" w:space="0" w:color="D3D3D3"/>
-              <w:start w:val="single" w:space="0" w:color="D3D3D3"/>
-              <w:end w:val="single" w:space="0" w:color="D3D3D3"/>
-            </w:tcBorders>
-          </w:tcPr>
-          <w:p>
-            <w:pPr>
-              <w:spacing w:before="0" w:after="60"/>
-              <w:keepNext/>
-              <w:jc w:val="center"/>
-            </w:pPr>
-            <w:r>
-              <w:rPr>
-                <w:rFonts w:ascii="Calibri" w:hAnsi="Calibri"/>
-                <w:sz w:val="20"/>
-              </w:rPr>
-              <w:t xml:space="default">-1·1 to 3·3</w:t>
-            </w:r>
-          </w:p>
-        </w:tc>
-        <w:tc>
-          <w:tcPr>
-            <w:tcBorders>
-              <w:top w:val="single" w:space="0" w:color="D3D3D3"/>
-              <w:bottom w:val="single" w:space="0" w:color="D3D3D3"/>
-              <w:start w:val="single" w:space="0" w:color="D3D3D3"/>
-              <w:end w:val="single" w:space="0" w:color="D3D3D3"/>
-            </w:tcBorders>
-          </w:tcPr>
-          <w:p>
-            <w:pPr>
-              <w:spacing w:before="0" w:after="60"/>
-              <w:keepNext/>
-              <w:jc w:val="center"/>
-            </w:pPr>
-            <w:r>
-              <w:rPr>
-                <w:rFonts w:ascii="Calibri" w:hAnsi="Calibri"/>
-                <w:sz w:val="20"/>
-              </w:rPr>
-              <w:t xml:space="default">0·34</w:t>
+              <w:t xml:space="default">1·3</w:t>
+            </w:r>
+          </w:p>
+        </w:tc>
+        <w:tc>
+          <w:tcPr>
+            <w:tcBorders>
+              <w:top w:val="single" w:space="0" w:color="D3D3D3"/>
+              <w:bottom w:val="single" w:space="0" w:color="D3D3D3"/>
+              <w:start w:val="single" w:space="0" w:color="D3D3D3"/>
+              <w:end w:val="single" w:space="0" w:color="D3D3D3"/>
+            </w:tcBorders>
+          </w:tcPr>
+          <w:p>
+            <w:pPr>
+              <w:spacing w:before="0" w:after="60"/>
+              <w:keepNext/>
+              <w:jc w:val="center"/>
+            </w:pPr>
+            <w:r>
+              <w:rPr>
+                <w:rFonts w:ascii="Calibri" w:hAnsi="Calibri"/>
+                <w:sz w:val="20"/>
+              </w:rPr>
+              <w:t xml:space="default">-0·91 to 3·5</w:t>
+            </w:r>
+          </w:p>
+        </w:tc>
+        <w:tc>
+          <w:tcPr>
+            <w:tcBorders>
+              <w:top w:val="single" w:space="0" w:color="D3D3D3"/>
+              <w:bottom w:val="single" w:space="0" w:color="D3D3D3"/>
+              <w:start w:val="single" w:space="0" w:color="D3D3D3"/>
+              <w:end w:val="single" w:space="0" w:color="D3D3D3"/>
+            </w:tcBorders>
+          </w:tcPr>
+          <w:p>
+            <w:pPr>
+              <w:spacing w:before="0" w:after="60"/>
+              <w:keepNext/>
+              <w:jc w:val="center"/>
+            </w:pPr>
+            <w:r>
+              <w:rPr>
+                <w:rFonts w:ascii="Calibri" w:hAnsi="Calibri"/>
+                <w:sz w:val="20"/>
+              </w:rPr>
+              <w:t xml:space="default">0·25</w:t>
             </w:r>
           </w:p>
         </w:tc>
@@ -1075,7 +1075,7 @@
                 <w:rFonts w:ascii="Calibri" w:hAnsi="Calibri"/>
                 <w:sz w:val="20"/>
               </w:rPr>
-              <w:t xml:space="default">-1·2</w:t>
+              <w:t xml:space="default">-1·1</w:t>
             </w:r>
           </w:p>
         </w:tc>
@@ -1123,7 +1123,7 @@
                 <w:rFonts w:ascii="Calibri" w:hAnsi="Calibri"/>
                 <w:sz w:val="20"/>
               </w:rPr>
-              <w:t xml:space="default">0·31</w:t>
+              <w:t xml:space="default">0·32</w:t>
             </w:r>
           </w:p>
         </w:tc>
@@ -1177,55 +1177,55 @@
                 <w:rFonts w:ascii="Calibri" w:hAnsi="Calibri"/>
                 <w:sz w:val="20"/>
               </w:rPr>
-              <w:t xml:space="default">-0·59</w:t>
-            </w:r>
-          </w:p>
-        </w:tc>
-        <w:tc>
-          <w:tcPr>
-            <w:tcBorders>
-              <w:top w:val="single" w:space="0" w:color="D3D3D3"/>
-              <w:bottom w:val="single" w:space="0" w:color="D3D3D3"/>
-              <w:start w:val="single" w:space="0" w:color="D3D3D3"/>
-              <w:end w:val="single" w:space="0" w:color="D3D3D3"/>
-            </w:tcBorders>
-          </w:tcPr>
-          <w:p>
-            <w:pPr>
-              <w:spacing w:before="0" w:after="60"/>
-              <w:keepNext/>
-              <w:jc w:val="center"/>
-            </w:pPr>
-            <w:r>
-              <w:rPr>
-                <w:rFonts w:ascii="Calibri" w:hAnsi="Calibri"/>
-                <w:sz w:val="20"/>
-              </w:rPr>
-              <w:t xml:space="default">-1·5 to 0·35</w:t>
-            </w:r>
-          </w:p>
-        </w:tc>
-        <w:tc>
-          <w:tcPr>
-            <w:tcBorders>
-              <w:top w:val="single" w:space="0" w:color="D3D3D3"/>
-              <w:bottom w:val="single" w:space="0" w:color="D3D3D3"/>
-              <w:start w:val="single" w:space="0" w:color="D3D3D3"/>
-              <w:end w:val="single" w:space="0" w:color="D3D3D3"/>
-            </w:tcBorders>
-          </w:tcPr>
-          <w:p>
-            <w:pPr>
-              <w:spacing w:before="0" w:after="60"/>
-              <w:keepNext/>
-              <w:jc w:val="center"/>
-            </w:pPr>
-            <w:r>
-              <w:rPr>
-                <w:rFonts w:ascii="Calibri" w:hAnsi="Calibri"/>
-                <w:sz w:val="20"/>
-              </w:rPr>
-              <w:t xml:space="default">0·22</w:t>
+              <w:t xml:space="default">-0·42</w:t>
+            </w:r>
+          </w:p>
+        </w:tc>
+        <w:tc>
+          <w:tcPr>
+            <w:tcBorders>
+              <w:top w:val="single" w:space="0" w:color="D3D3D3"/>
+              <w:bottom w:val="single" w:space="0" w:color="D3D3D3"/>
+              <w:start w:val="single" w:space="0" w:color="D3D3D3"/>
+              <w:end w:val="single" w:space="0" w:color="D3D3D3"/>
+            </w:tcBorders>
+          </w:tcPr>
+          <w:p>
+            <w:pPr>
+              <w:spacing w:before="0" w:after="60"/>
+              <w:keepNext/>
+              <w:jc w:val="center"/>
+            </w:pPr>
+            <w:r>
+              <w:rPr>
+                <w:rFonts w:ascii="Calibri" w:hAnsi="Calibri"/>
+                <w:sz w:val="20"/>
+              </w:rPr>
+              <w:t xml:space="default">-1·3 to 0·50</w:t>
+            </w:r>
+          </w:p>
+        </w:tc>
+        <w:tc>
+          <w:tcPr>
+            <w:tcBorders>
+              <w:top w:val="single" w:space="0" w:color="D3D3D3"/>
+              <w:bottom w:val="single" w:space="0" w:color="D3D3D3"/>
+              <w:start w:val="single" w:space="0" w:color="D3D3D3"/>
+              <w:end w:val="single" w:space="0" w:color="D3D3D3"/>
+            </w:tcBorders>
+          </w:tcPr>
+          <w:p>
+            <w:pPr>
+              <w:spacing w:before="0" w:after="60"/>
+              <w:keepNext/>
+              <w:jc w:val="center"/>
+            </w:pPr>
+            <w:r>
+              <w:rPr>
+                <w:rFonts w:ascii="Calibri" w:hAnsi="Calibri"/>
+                <w:sz w:val="20"/>
+              </w:rPr>
+              <w:t xml:space="default">0·37</w:t>
             </w:r>
           </w:p>
         </w:tc>
@@ -1404,31 +1404,31 @@
                 <w:rFonts w:ascii="Calibri" w:hAnsi="Calibri"/>
                 <w:sz w:val="20"/>
               </w:rPr>
-              <w:t xml:space="default">0·30 to 4·5</w:t>
-            </w:r>
-          </w:p>
-        </w:tc>
-        <w:tc>
-          <w:tcPr>
-            <w:tcBorders>
-              <w:top w:val="single" w:space="0" w:color="D3D3D3"/>
-              <w:bottom w:val="single" w:space="0" w:color="D3D3D3"/>
-              <w:start w:val="single" w:space="0" w:color="D3D3D3"/>
-              <w:end w:val="single" w:space="0" w:color="D3D3D3"/>
-            </w:tcBorders>
-          </w:tcPr>
-          <w:p>
-            <w:pPr>
-              <w:spacing w:before="0" w:after="60"/>
-              <w:keepNext/>
-              <w:jc w:val="center"/>
-            </w:pPr>
-            <w:r>
-              <w:rPr>
-                <w:rFonts w:ascii="Calibri" w:hAnsi="Calibri"/>
-                <w:sz w:val="20"/>
-              </w:rPr>
-              <w:t xml:space="default">0·025</w:t>
+              <w:t xml:space="default">0·28 to 4·5</w:t>
+            </w:r>
+          </w:p>
+        </w:tc>
+        <w:tc>
+          <w:tcPr>
+            <w:tcBorders>
+              <w:top w:val="single" w:space="0" w:color="D3D3D3"/>
+              <w:bottom w:val="single" w:space="0" w:color="D3D3D3"/>
+              <w:start w:val="single" w:space="0" w:color="D3D3D3"/>
+              <w:end w:val="single" w:space="0" w:color="D3D3D3"/>
+            </w:tcBorders>
+          </w:tcPr>
+          <w:p>
+            <w:pPr>
+              <w:spacing w:before="0" w:after="60"/>
+              <w:keepNext/>
+              <w:jc w:val="center"/>
+            </w:pPr>
+            <w:r>
+              <w:rPr>
+                <w:rFonts w:ascii="Calibri" w:hAnsi="Calibri"/>
+                <w:sz w:val="20"/>
+              </w:rPr>
+              <w:t xml:space="default">0·027</w:t>
             </w:r>
           </w:p>
         </w:tc>
@@ -1505,31 +1505,31 @@
                 <w:rFonts w:ascii="Calibri" w:hAnsi="Calibri"/>
                 <w:sz w:val="20"/>
               </w:rPr>
-              <w:t xml:space="default">1·2 to 6·5</w:t>
-            </w:r>
-          </w:p>
-        </w:tc>
-        <w:tc>
-          <w:tcPr>
-            <w:tcBorders>
-              <w:top w:val="single" w:space="0" w:color="D3D3D3"/>
-              <w:bottom w:val="single" w:space="0" w:color="D3D3D3"/>
-              <w:start w:val="single" w:space="0" w:color="D3D3D3"/>
-              <w:end w:val="single" w:space="0" w:color="D3D3D3"/>
-            </w:tcBorders>
-          </w:tcPr>
-          <w:p>
-            <w:pPr>
-              <w:spacing w:before="0" w:after="60"/>
-              <w:keepNext/>
-              <w:jc w:val="center"/>
-            </w:pPr>
-            <w:r>
-              <w:rPr>
-                <w:rFonts w:ascii="Calibri" w:hAnsi="Calibri"/>
-                <w:sz w:val="20"/>
-              </w:rPr>
-              <w:t xml:space="default">0·0044</w:t>
+              <w:t xml:space="default">1·2 to 6·4</w:t>
+            </w:r>
+          </w:p>
+        </w:tc>
+        <w:tc>
+          <w:tcPr>
+            <w:tcBorders>
+              <w:top w:val="single" w:space="0" w:color="D3D3D3"/>
+              <w:bottom w:val="single" w:space="0" w:color="D3D3D3"/>
+              <w:start w:val="single" w:space="0" w:color="D3D3D3"/>
+              <w:end w:val="single" w:space="0" w:color="D3D3D3"/>
+            </w:tcBorders>
+          </w:tcPr>
+          <w:p>
+            <w:pPr>
+              <w:spacing w:before="0" w:after="60"/>
+              <w:keepNext/>
+              <w:jc w:val="center"/>
+            </w:pPr>
+            <w:r>
+              <w:rPr>
+                <w:rFonts w:ascii="Calibri" w:hAnsi="Calibri"/>
+                <w:sz w:val="20"/>
+              </w:rPr>
+              <w:t xml:space="default">0·0046</w:t>
             </w:r>
           </w:p>
         </w:tc>
@@ -1606,31 +1606,31 @@
                 <w:rFonts w:ascii="Calibri" w:hAnsi="Calibri"/>
                 <w:sz w:val="20"/>
               </w:rPr>
-              <w:t xml:space="default">0·96 to 5·9</w:t>
-            </w:r>
-          </w:p>
-        </w:tc>
-        <w:tc>
-          <w:tcPr>
-            <w:tcBorders>
-              <w:top w:val="single" w:space="0" w:color="D3D3D3"/>
-              <w:bottom w:val="single" w:space="0" w:color="D3D3D3"/>
-              <w:start w:val="single" w:space="0" w:color="D3D3D3"/>
-              <w:end w:val="single" w:space="0" w:color="D3D3D3"/>
-            </w:tcBorders>
-          </w:tcPr>
-          <w:p>
-            <w:pPr>
-              <w:spacing w:before="0" w:after="60"/>
-              <w:keepNext/>
-              <w:jc w:val="center"/>
-            </w:pPr>
-            <w:r>
-              <w:rPr>
-                <w:rFonts w:ascii="Calibri" w:hAnsi="Calibri"/>
-                <w:sz w:val="20"/>
-              </w:rPr>
-              <w:t xml:space="default">0·0067</w:t>
+              <w:t xml:space="default">0·94 to 5·8</w:t>
+            </w:r>
+          </w:p>
+        </w:tc>
+        <w:tc>
+          <w:tcPr>
+            <w:tcBorders>
+              <w:top w:val="single" w:space="0" w:color="D3D3D3"/>
+              <w:bottom w:val="single" w:space="0" w:color="D3D3D3"/>
+              <w:start w:val="single" w:space="0" w:color="D3D3D3"/>
+              <w:end w:val="single" w:space="0" w:color="D3D3D3"/>
+            </w:tcBorders>
+          </w:tcPr>
+          <w:p>
+            <w:pPr>
+              <w:spacing w:before="0" w:after="60"/>
+              <w:keepNext/>
+              <w:jc w:val="center"/>
+            </w:pPr>
+            <w:r>
+              <w:rPr>
+                <w:rFonts w:ascii="Calibri" w:hAnsi="Calibri"/>
+                <w:sz w:val="20"/>
+              </w:rPr>
+              <w:t xml:space="default">0·0069</w:t>
             </w:r>
           </w:p>
         </w:tc>
@@ -1707,7 +1707,7 @@
                 <w:rFonts w:ascii="Calibri" w:hAnsi="Calibri"/>
                 <w:sz w:val="20"/>
               </w:rPr>
-              <w:t xml:space="default">-0·63 to 4·9</w:t>
+              <w:t xml:space="default">-0·65 to 4·9</w:t>
             </w:r>
           </w:p>
         </w:tc>
@@ -1808,31 +1808,31 @@
                 <w:rFonts w:ascii="Calibri" w:hAnsi="Calibri"/>
                 <w:sz w:val="20"/>
               </w:rPr>
-              <w:t xml:space="default">1·3 to 7·3</w:t>
-            </w:r>
-          </w:p>
-        </w:tc>
-        <w:tc>
-          <w:tcPr>
-            <w:tcBorders>
-              <w:top w:val="single" w:space="0" w:color="D3D3D3"/>
-              <w:bottom w:val="single" w:space="0" w:color="D3D3D3"/>
-              <w:start w:val="single" w:space="0" w:color="D3D3D3"/>
-              <w:end w:val="single" w:space="0" w:color="D3D3D3"/>
-            </w:tcBorders>
-          </w:tcPr>
-          <w:p>
-            <w:pPr>
-              <w:spacing w:before="0" w:after="60"/>
-              <w:keepNext/>
-              <w:jc w:val="center"/>
-            </w:pPr>
-            <w:r>
-              <w:rPr>
-                <w:rFonts w:ascii="Calibri" w:hAnsi="Calibri"/>
-                <w:sz w:val="20"/>
-              </w:rPr>
-              <w:t xml:space="default">0·0051</w:t>
+              <w:t xml:space="default">1·3 to 7·2</w:t>
+            </w:r>
+          </w:p>
+        </w:tc>
+        <w:tc>
+          <w:tcPr>
+            <w:tcBorders>
+              <w:top w:val="single" w:space="0" w:color="D3D3D3"/>
+              <w:bottom w:val="single" w:space="0" w:color="D3D3D3"/>
+              <w:start w:val="single" w:space="0" w:color="D3D3D3"/>
+              <w:end w:val="single" w:space="0" w:color="D3D3D3"/>
+            </w:tcBorders>
+          </w:tcPr>
+          <w:p>
+            <w:pPr>
+              <w:spacing w:before="0" w:after="60"/>
+              <w:keepNext/>
+              <w:jc w:val="center"/>
+            </w:pPr>
+            <w:r>
+              <w:rPr>
+                <w:rFonts w:ascii="Calibri" w:hAnsi="Calibri"/>
+                <w:sz w:val="20"/>
+              </w:rPr>
+              <w:t xml:space="default">0·0052</w:t>
             </w:r>
           </w:p>
         </w:tc>
@@ -2112,7 +2112,7 @@
                 <w:rFonts w:ascii="Calibri" w:hAnsi="Calibri"/>
                 <w:sz w:val="20"/>
               </w:rPr>
-              <w:t xml:space="default">-2·3 to 0·35</w:t>
+              <w:t xml:space="default">-2·3 to 0·34</w:t>
             </w:r>
           </w:p>
         </w:tc>
@@ -2517,7 +2517,7 @@
                 <w:rFonts w:ascii="Calibri" w:hAnsi="Calibri"/>
                 <w:sz w:val="20"/>
               </w:rPr>
-              <w:t xml:space="default">0·58 to 0·77</w:t>
+              <w:t xml:space="default">0·58 to 0·76</w:t>
             </w:r>
           </w:p>
         </w:tc>

</xml_diff>